<commit_message>
Switch to local ESP32 control
</commit_message>
<xml_diff>
--- a/docs/feeding-nimo-client-guide.docx
+++ b/docs/feeding-nimo-client-guide.docx
@@ -117,7 +117,7 @@
             <w:color w:val="0A7B8E"/>
             <w:u w:val="single"/>
           </w:rPr>
-          <w:t xml:space="preserve">https://aqua-watch-backend.vercel.app</w:t>
+          <w:t xml:space="preserve">https://feeding-nimo.vercel.app</w:t>
         </w:r>
       </w:hyperlink>
     </w:p>
@@ -268,7 +268,7 @@
         </w:numPr>
       </w:pPr>
       <w:r>
-        <w:t xml:space="preserve">Leave API Base as https://aqua-watch-backend.vercel.app.</w:t>
+        <w:t xml:space="preserve">Leave API Base as https://feeding-nimo.vercel.app.</w:t>
       </w:r>
     </w:p>
     <w:p>

</xml_diff>